<commit_message>
vignettes for 50 states year 2024 AHR 30th
</commit_message>
<xml_diff>
--- a/state-vignettes/alabama_highway_report.docx
+++ b/state-vignettes/alabama_highway_report.docx
@@ -10,12 +10,12 @@
         <w:rPr>
           <w:color w:val="FF5500"/>
         </w:rPr>
-        <w:t>Alabama Ranks 8th in the Nation in Highway Performance and Cost-Effectiveness</w:t>
+        <w:t>Alabama Ranks 2nd in the Nation in Highway Performance and Cost-Effectiveness</w:t>
       </w:r>
     </w:p>
     <w:p>
       <w:r>
-        <w:t>Alabama’s highway system ranks 8th in the nation in overall cost-effectiveness and condition.</w:t>
+        <w:t>Alabama’s highway system ranks 2nd in the nation in overall cost-effectiveness and condition.</w:t>
       </w:r>
     </w:p>
     <w:p>
@@ -25,42 +25,42 @@
     </w:p>
     <w:p>
       <w:r>
-        <w:t>In safety and condition categories, Alabama’s highways rank 30th in urban Interstate pavement condition, 32nd in rural Interstate pavement condition, 1st in urban arterial pavement condition, 5th in rural arterial pavement condition, 8th in structurally deficient bridges, 28th in urban fatality rate, and 44th in rural fatality rate.</w:t>
+        <w:t>In safety and condition categories, Alabama’s highways rank 23rd in urban Interstate pavement condition, 30th in rural Interstate pavement condition, 3rd in urban arterial pavement condition, 11th in rural arterial pavement condition, 9th in structurally deficient bridges, 36th in urban fatality rate, and 42nd in rural fatality rate.</w:t>
       </w:r>
     </w:p>
     <w:p>
       <w:r>
-        <w:t>Alabama ranks 14th out of the 50 states in traffic congestion, and its drivers spend 14.5 hours a year stuck in traffic congestion.</w:t>
+        <w:t>Alabama ranks 12th out of the 50 states in traffic congestion, and its drivers spend 14.92 hours a year stuck in traffic congestion.</w:t>
       </w:r>
     </w:p>
     <w:p>
       <w:r>
-        <w:t>In spending and cost-effectiveness, Alabama ranks 13th in capital and bridge disbursements, which are the costs of building new roads and bridges and widening existing ones. Alabama ranks 1st in maintenance spending, such as the costs of repaving roads and filling in potholes. Alabama’s administrative disbursements, including office spending that doesn’t make its way to roads, rank 41st nationwide.</w:t>
+        <w:t>In spending and cost-effectiveness, Alabama ranks 8th in capital and bridge disbursements, which are the costs of building new roads and bridges and widening existing ones. Alabama ranks 1st in maintenance spending, such as the costs of repaving roads and filling in potholes. Alabama’s administrative disbursements, including office spending that doesn’t make its way to roads, rank 34th nationwide.</w:t>
       </w:r>
     </w:p>
     <w:p>
       <w:r>
-        <w:t>Compared to last year, Alabama has the following notable changes in rankings: Rural Fatality Rate worsened by 11 points, from 33 to 44; Capital &amp; Bridge Disbursements improved by 9 points, from 22 to 13; Other Disbursements improved by 41 points, from 46 to 5; Overall improved by 9 points, from 17 to 8.</w:t>
+        <w:t>Compared to last year, Alabama has the following notable changes in rankings: Overall improved by 6 points, from 8 to 2; Capital &amp; Bridge Disbursements improved by 5 points, from 13 to 8; Administrative Disbursements improved by 7 points, from 41 to 34; Urban Interstate Pavement Condition improved by 7 points, from 30 to 23; Rural Other Principal Arterial Pavement Condition worsened by 6 points, from 5 to 11; Urban Fatality Rate worsened by 8 points, from 28 to 36.</w:t>
       </w:r>
     </w:p>
     <w:p>
       <w:r>
-        <w:t>Compared to neighboring and nearby states, Alabama’s overall highway performance is better than Florida (14th), Mississippi (24th), and Arkansas (21st); worse than Georgia (2nd) and South Carolina (3rd).</w:t>
+        <w:t>Compared to neighboring and nearby states, Alabama’s overall highway performance is better than Florida (10th), Georgia (4th), Mississippi (22nd), Arkansas (17th), and South Carolina (7th).</w:t>
       </w:r>
     </w:p>
     <w:p>
       <w:r>
-        <w:t>Comparing its overall performance to similarly populated states, Alabama ranks better than Kentucky (15th) and Louisiana (46th).</w:t>
+        <w:t>Comparing its overall performance to similarly populated states, Alabama ranks better than Kentucky (11th) and Louisiana (44th).</w:t>
       </w:r>
     </w:p>
     <w:p>
       <w:r>
-        <w:t>Alabama’s highway system ranks 8th out of 50 states overall this year, compared to 17th last year.</w:t>
+        <w:t>Alabama’s highway system ranks 2nd out of 50 states overall this year, compared to 8th last year.</w:t>
       </w:r>
     </w:p>
     <w:p>
       <w:r>
-        <w:t>“In terms of improving in the road condition and performance categories, Alabama should focus on reducing Rural Fatality Rate and Administrative Disbursements. Alabama’s rank of 44th in Rural Fatality Rate makes it one of the worst in the nation for this safety metric,” said Baruch Feigenbaum, lead author of the 29th Annual Highway Report and senior managing director of transportation policy at Reason Foundation.</w:t>
+        <w:t>“In terms of improving in the road condition and performance categories, Alabama should focus on reducing Rural Fatality Rate and Urban Fatality Rate. Alabama’s rank of 42nd in Rural Fatality Rate makes it one of the worst in the nation for this safety metric,” said Baruch Feigenbaum, lead author of the 30th Annual Highway Report and senior managing director of transportation policy at Reason Foundation.</w:t>
       </w:r>
     </w:p>
     <w:p>
@@ -70,7 +70,7 @@
           <w:color w:val="FF5500"/>
           <w:sz w:val="28"/>
         </w:rPr>
-        <w:t>ALABAMA’S RANKINGS IN THE 29TH ANNUAL HIGHWAY REPORT</w:t>
+        <w:t>ALABAMA’S RANKINGS IN THE 30TH ANNUAL HIGHWAY REPORT</w:t>
       </w:r>
     </w:p>
     <w:tbl>
@@ -148,7 +148,7 @@
               <w:rPr>
                 <w:sz w:val="20"/>
               </w:rPr>
-              <w:t>8</w:t>
+              <w:t>2</w:t>
             </w:r>
           </w:p>
         </w:tc>
@@ -179,7 +179,7 @@
               <w:rPr>
                 <w:sz w:val="20"/>
               </w:rPr>
-              <w:t>13</w:t>
+              <w:t>8</w:t>
             </w:r>
           </w:p>
         </w:tc>
@@ -243,7 +243,7 @@
               <w:rPr>
                 <w:sz w:val="20"/>
               </w:rPr>
-              <w:t>41</w:t>
+              <w:t>34</w:t>
             </w:r>
           </w:p>
         </w:tc>
@@ -276,7 +276,7 @@
               <w:rPr>
                 <w:sz w:val="20"/>
               </w:rPr>
-              <w:t>5</w:t>
+              <w:t>4</w:t>
             </w:r>
           </w:p>
         </w:tc>
@@ -307,7 +307,7 @@
               <w:rPr>
                 <w:sz w:val="20"/>
               </w:rPr>
-              <w:t>32</w:t>
+              <w:t>30</w:t>
             </w:r>
           </w:p>
         </w:tc>
@@ -340,7 +340,7 @@
               <w:rPr>
                 <w:sz w:val="20"/>
               </w:rPr>
-              <w:t>5</w:t>
+              <w:t>11</w:t>
             </w:r>
           </w:p>
         </w:tc>
@@ -371,7 +371,7 @@
               <w:rPr>
                 <w:sz w:val="20"/>
               </w:rPr>
-              <w:t>30</w:t>
+              <w:t>23</w:t>
             </w:r>
           </w:p>
         </w:tc>
@@ -404,7 +404,7 @@
               <w:rPr>
                 <w:sz w:val="20"/>
               </w:rPr>
-              <w:t>1</w:t>
+              <w:t>3</w:t>
             </w:r>
           </w:p>
         </w:tc>
@@ -435,7 +435,7 @@
               <w:rPr>
                 <w:sz w:val="20"/>
               </w:rPr>
-              <w:t>14</w:t>
+              <w:t>12</w:t>
             </w:r>
           </w:p>
         </w:tc>
@@ -468,7 +468,7 @@
               <w:rPr>
                 <w:sz w:val="20"/>
               </w:rPr>
-              <w:t>8</w:t>
+              <w:t>9</w:t>
             </w:r>
           </w:p>
         </w:tc>
@@ -499,7 +499,7 @@
               <w:rPr>
                 <w:sz w:val="20"/>
               </w:rPr>
-              <w:t>44</w:t>
+              <w:t>42</w:t>
             </w:r>
           </w:p>
         </w:tc>
@@ -532,7 +532,7 @@
               <w:rPr>
                 <w:sz w:val="20"/>
               </w:rPr>
-              <w:t>28</w:t>
+              <w:t>36</w:t>
             </w:r>
           </w:p>
         </w:tc>
@@ -563,7 +563,7 @@
               <w:rPr>
                 <w:sz w:val="20"/>
               </w:rPr>
-              <w:t>25</w:t>
+              <w:t>29</w:t>
             </w:r>
           </w:p>
         </w:tc>
@@ -572,12 +572,12 @@
     <w:p>
       <w:r>
         <w:br/>
-        <w:t>Reason Foundation’s 29th Annual Highway Report measures the condition and cost- effectiveness of state-controlled highways in 13 categories, including pavement and bridge conditions, traffic fatalities, and spending. In the performance categories, ranking first implies the state has the best or lowest fatality rate and its road pavement is in the best condition. A ranking of 50th in performance categories means the state has the worst fatality rates or pavement conditions. In simplified terms, in the cost-effectiveness categories, a rank of 50 means the state spends more money, and a first-place ranking means the state spends less money than other states in that category.</w:t>
+        <w:t>Reason Foundation’s 30th Annual Highway Report measures the condition and cost-effectiveness of state-controlled highways in 13 categories, including pavement and bridge conditions, traffic fatalities, and spending. In the performance categories, ranking first implies the state has the best or lowest fatality rate and its road pavement is in the best condition. A ranking of 50th in performance categories means the state has the worst fatality rates or pavement conditions. In simplified terms, in the cost-effectiveness categories, a rank of 50 means the state spends more money, and a first-place ranking means the state spends less money than other states in that category.</w:t>
       </w:r>
     </w:p>
     <w:p>
       <w:r>
-        <w:t>The report’s data are primarily information each state directly reported to the Federal Highway Administration for 2023. Better Roads and Bridges provides the deficient bridge data, and INRIX.com provides the traffic congestion data.</w:t>
+        <w:t>The report’s data are primarily information each state directly reported to the Federal Highway Administration for 2024. Better Roads and Bridges provides the deficient bridge data, and INRIX.com provides the traffic congestion data.</w:t>
       </w:r>
     </w:p>
     <w:sectPr>

</xml_diff>